<commit_message>
Rework Alignment Room flow: all capture live in the room after NIST framing, personas move to 1:1s
Co-Authored-By: Claude Fable 5 <noreply@anthropic.com>
Claude-Session: https://claude.ai/code/session_01PPCVtAbEtcwFeYVLmMaxYT
</commit_message>
<xml_diff>
--- a/section-ai-alignment/word/08 Alignment Room concept.docx
+++ b/section-ai-alignment/word/08 Alignment Room concept.docx
@@ -2,7 +2,7 @@
 <file path=word/document.xml><?xml version="1.0" encoding="utf-8"?>
 <w:document xmlns:w="http://schemas.openxmlformats.org/wordprocessingml/2006/main" xmlns:m="http://schemas.openxmlformats.org/officeDocument/2006/math" xmlns:r="http://schemas.openxmlformats.org/officeDocument/2006/relationships" xmlns:o="urn:schemas-microsoft-com:office:office" xmlns:v="urn:schemas-microsoft-com:vml" xmlns:w10="urn:schemas-microsoft-com:office:word" xmlns:a="http://schemas.openxmlformats.org/drawingml/2006/main" xmlns:pic="http://schemas.openxmlformats.org/drawingml/2006/picture" xmlns:wp="http://schemas.openxmlformats.org/drawingml/2006/wordprocessingDrawing">
   <w:body>
-    <w:bookmarkStart w:id="29" w:name="X8750f297e0c128c1124ec8e13465529e11f6b40"/>
+    <w:bookmarkStart w:id="30" w:name="X8750f297e0c128c1124ec8e13465529e11f6b40"/>
     <w:p>
       <w:pPr>
         <w:pStyle w:val="Heading1"/>
@@ -104,22 +104,30 @@
       </w:r>
     </w:p>
     <w:bookmarkEnd w:id="20"/>
-    <w:bookmarkStart w:id="25" w:name="the-flow"/>
+    <w:bookmarkStart w:id="26" w:name="the-flow-everything-happens-in-the-room"/>
     <w:p>
       <w:pPr>
         <w:pStyle w:val="Heading2"/>
       </w:pPr>
       <w:r>
-        <w:t xml:space="preserve">The flow</w:t>
-      </w:r>
-    </w:p>
-    <w:bookmarkStart w:id="21" w:name="Xeefd0c01c7a1e238cbba514375a1cff8d02b1fb"/>
+        <w:t xml:space="preserve">The flow (everything happens in the room)</w:t>
+      </w:r>
+    </w:p>
+    <w:p>
+      <w:pPr>
+        <w:pStyle w:val="FirstParagraph"/>
+      </w:pPr>
+      <w:r>
+        <w:t xml:space="preserve">Jeanna’s call, 22 July: no pre-work. Pre-work gets filled out badly or not at all, and answers given before anyone has explained the why are shallow answers. The capture happens live, after the framing. This also fixes a facilitation problem: silent individual capture in the room, before any group discussion of the specifics, is the classic guard against anchoring; the loudest voice can’t set everyone’s answers if everyone has already answered.</w:t>
+      </w:r>
+    </w:p>
+    <w:bookmarkStart w:id="21" w:name="Xf49fb677b9b5ce356cce1c68b830f14678d7234"/>
     <w:p>
       <w:pPr>
         <w:pStyle w:val="Heading3"/>
       </w:pPr>
       <w:r>
-        <w:t xml:space="preserve">1. Before the session: the individual link (15 to 20 minutes per leader)</w:t>
+        <w:t xml:space="preserve">1. First: the why, and the cost of not doing it (about 30 minutes)</w:t>
       </w:r>
     </w:p>
     <w:p>
@@ -127,7 +135,25 @@
         <w:pStyle w:val="FirstParagraph"/>
       </w:pPr>
       <w:r>
-        <w:t xml:space="preserve">Each member of the leadership team gets a personal link. An agent walks them through the workbook’s Section 1, one question at a time, in vooee’s voice:</w:t>
+        <w:t xml:space="preserve">Jeanna presents the NIST framing in plain English (the quick-start’s four questions: who decides, where do we need a human gate, how do we know it works, what’s the plan for a bad day) and the cost of skipping it: the incident stories, the Notifiable Data Breaches deadlines, the free-chatbot discovery most businesses get to make exactly once. The Section stats earn their place here (52% anxious, 3% proficient). Nobody answers anything yet; this is why the answers will be honest.</w:t>
+      </w:r>
+    </w:p>
+    <w:bookmarkEnd w:id="21"/>
+    <w:bookmarkStart w:id="22" w:name="X9b9fe98380782f72c0dee640426f119bc2ecf6c"/>
+    <w:p>
+      <w:pPr>
+        <w:pStyle w:val="Heading3"/>
+      </w:pPr>
+      <w:r>
+        <w:t xml:space="preserve">2. Then: silent capture, live in the room (15 to 20 minutes)</w:t>
+      </w:r>
+    </w:p>
+    <w:p>
+      <w:pPr>
+        <w:pStyle w:val="FirstParagraph"/>
+      </w:pPr>
+      <w:r>
+        <w:t xml:space="preserve">QR code on the screen; each leader opens their personal link on their own device and answers alone, in silence, coffee in hand:</w:t>
       </w:r>
       <w:r>
         <w:t xml:space="preserve"> </w:t>
@@ -171,35 +197,13 @@
       <w:r>
         <w:t xml:space="preserve">- Their personal list of decisions that must stay human</w:t>
       </w:r>
-      <w:r>
-        <w:t xml:space="preserve"> </w:t>
-      </w:r>
-      <w:r>
-        <w:t xml:space="preserve">-</w:t>
-      </w:r>
-      <w:r>
-        <w:t xml:space="preserve"> </w:t>
-      </w:r>
-      <w:r>
-        <w:rPr>
-          <w:bCs/>
-          <w:b/>
-        </w:rPr>
-        <w:t xml:space="preserve">The boundaries interview</w:t>
-      </w:r>
-      <w:r>
-        <w:t xml:space="preserve"> </w:t>
-      </w:r>
-      <w:r>
-        <w:t xml:space="preserve">(the constitution layer, below)</w:t>
-      </w:r>
     </w:p>
     <w:p>
       <w:pPr>
         <w:pStyle w:val="BodyText"/>
       </w:pPr>
       <w:r>
-        <w:t xml:space="preserve">Answers are private to Jeanna until the session. The agent probes one level deeper the way Expert OS does (</w:t>
+        <w:t xml:space="preserve">The agent probes one level deeper the way Expert OS does (</w:t>
       </w:r>
       <w:r>
         <w:t xml:space="preserve">“</w:t>
@@ -211,17 +215,17 @@
         <w:t xml:space="preserve">”</w:t>
       </w:r>
       <w:r>
-        <w:t xml:space="preserve">).</w:t>
-      </w:r>
-    </w:p>
-    <w:bookmarkEnd w:id="21"/>
-    <w:bookmarkStart w:id="22" w:name="X72843c5f1ad0fb8846f14210f0f0b8ddf1fe070"/>
+        <w:t xml:space="preserve">). Answers go to Jeanna, not to the group.</w:t>
+      </w:r>
+    </w:p>
+    <w:bookmarkEnd w:id="22"/>
+    <w:bookmarkStart w:id="23" w:name="the-break-that-does-the-work-10-minutes"/>
     <w:p>
       <w:pPr>
         <w:pStyle w:val="Heading3"/>
       </w:pPr>
       <w:r>
-        <w:t xml:space="preserve">2. Between link and room: the tension report (for Jeanna, automatic)</w:t>
+        <w:t xml:space="preserve">3. The break that does the work (10 minutes)</w:t>
       </w:r>
     </w:p>
     <w:p>
@@ -229,7 +233,7 @@
         <w:pStyle w:val="FirstParagraph"/>
       </w:pPr>
       <w:r>
-        <w:t xml:space="preserve">The system compares the leaders’ answers and produces a facilitator’s brief:</w:t>
+        <w:t xml:space="preserve">While the room refills coffee, the tension report generates. This is the reveal moment, and it has to be fast, which sets the engineering bar: the report is automatic, not something Jeanna assembles. It shows:</w:t>
       </w:r>
       <w:r>
         <w:t xml:space="preserve"> </w:t>
@@ -251,7 +255,7 @@
         <w:t xml:space="preserve"> </w:t>
       </w:r>
       <w:r>
-        <w:t xml:space="preserve">where the team already agrees (name them fast in the session, momentum matters)</w:t>
+        <w:t xml:space="preserve">where the team already agrees (name them fast, momentum matters)</w:t>
       </w:r>
       <w:r>
         <w:t xml:space="preserve"> </w:t>
@@ -361,23 +365,23 @@
         <w:t xml:space="preserve">”</w:t>
       </w:r>
       <w:r>
-        <w:t xml:space="preserve">; this shows them the five paragraphs.</w:t>
-      </w:r>
-      <w:r>
-        <w:t xml:space="preserve"> </w:t>
-      </w:r>
-      <w:r>
-        <w:t xml:space="preserve">Nothing is shown to the group without Jeanna deciding to show it; some tensions are better raised without attribution.</w:t>
-      </w:r>
-    </w:p>
-    <w:bookmarkEnd w:id="22"/>
-    <w:bookmarkStart w:id="23" w:name="Xeaff8b13ea7488ac8cbe0e10ef78a708c87ea6e"/>
+        <w:t xml:space="preserve">; this shows them the five paragraphs, twenty minutes after they wrote them.</w:t>
+      </w:r>
+      <w:r>
+        <w:t xml:space="preserve"> </w:t>
+      </w:r>
+      <w:r>
+        <w:t xml:space="preserve">Jeanna sees it first and decides what the group sees, and what gets raised without attribution.</w:t>
+      </w:r>
+    </w:p>
+    <w:bookmarkEnd w:id="23"/>
+    <w:bookmarkStart w:id="24" w:name="then-drafting-the-ground-rules-live"/>
     <w:p>
       <w:pPr>
         <w:pStyle w:val="Heading3"/>
       </w:pPr>
       <w:r>
-        <w:t xml:space="preserve">3. In the room: drafting the ground rules live</w:t>
+        <w:t xml:space="preserve">4. Then: drafting the ground rules live</w:t>
       </w:r>
     </w:p>
     <w:p>
@@ -385,19 +389,7 @@
         <w:pStyle w:val="FirstParagraph"/>
       </w:pPr>
       <w:r>
-        <w:t xml:space="preserve">The working session opens on the alignment map instead of a blank page. Then, projected live, AI drafts from their combined answers:</w:t>
-      </w:r>
-      <w:r>
-        <w:t xml:space="preserve"> </w:t>
-      </w:r>
-      <w:r>
-        <w:t xml:space="preserve">- The shared AI position paragraph (from five paragraphs to one, negotiated in the room)</w:t>
-      </w:r>
-      <w:r>
-        <w:t xml:space="preserve"> </w:t>
-      </w:r>
-      <w:r>
-        <w:t xml:space="preserve">- The</w:t>
+        <w:t xml:space="preserve">The discussion opens on the alignment map instead of a blank page. Then, projected live, AI drafts from their combined answers: the shared AI position (five paragraphs to one, negotiated aloud), the</w:t>
       </w:r>
       <w:r>
         <w:t xml:space="preserve"> </w:t>
@@ -415,19 +407,7 @@
         <w:t xml:space="preserve"> </w:t>
       </w:r>
       <w:r>
-        <w:t xml:space="preserve">list (union of individual lists, argued down to the absolute few)</w:t>
-      </w:r>
-      <w:r>
-        <w:t xml:space="preserve"> </w:t>
-      </w:r>
-      <w:r>
-        <w:t xml:space="preserve">- The policy template’s brackets, pre-filled from their answers and edited aloud</w:t>
-      </w:r>
-      <w:r>
-        <w:t xml:space="preserve"> </w:t>
-      </w:r>
-      <w:r>
-        <w:t xml:space="preserve">The theatre of this matters commercially: they watch their own words become their governance policy in minutes. That is the</w:t>
+        <w:t xml:space="preserve">list (union of lists, argued down to the absolute few), the policy template’s brackets pre-filled from their answers and edited in the room. They watch their own words become their governance policy within the same half-day they wrote them. That is the</w:t>
       </w:r>
       <w:r>
         <w:t xml:space="preserve"> </w:t>
@@ -448,14 +428,14 @@
         <w:t xml:space="preserve">moment from the summit, and it is also the product demo for everything else vooee sells.</w:t>
       </w:r>
     </w:p>
-    <w:bookmarkEnd w:id="23"/>
-    <w:bookmarkStart w:id="24" w:name="X2f10ef5e369cef09a169a84547d4793b40c239c"/>
+    <w:bookmarkEnd w:id="24"/>
+    <w:bookmarkStart w:id="25" w:name="X4ca9bd8a1e922cc80dd7f11612d966623eaf9f5"/>
     <w:p>
       <w:pPr>
         <w:pStyle w:val="Heading3"/>
       </w:pPr>
       <w:r>
-        <w:t xml:space="preserve">4. After the room: the persona layer (the part with legs)</w:t>
+        <w:t xml:space="preserve">5. Later, in the 1:1s: the persona layer (the part with legs)</w:t>
       </w:r>
     </w:p>
     <w:p>
@@ -463,7 +443,7 @@
         <w:pStyle w:val="FirstParagraph"/>
       </w:pPr>
       <w:r>
-        <w:t xml:space="preserve">The boundaries interview from step 1 gives each leader a personal charter: what they value, what they veto, what evidence convinces them, what they never want to see in work that reaches them, how they weigh risk against speed. Each charter becomes a</w:t>
+        <w:t xml:space="preserve">The full boundaries interview is too rich to rush in a group session, and it deserves the same treatment as the baseline: facilitated, not homework. It runs in each leader’s 1:1 slot during the 90 days (or a scheduled 30-minute call per leader), producing a personal charter: what they value, what they veto, what evidence convinces them, what they never want to see in work that reaches them, how they weigh risk against speed. Each charter becomes a</w:t>
       </w:r>
       <w:r>
         <w:t xml:space="preserve"> </w:t>
@@ -545,9 +525,9 @@
         <w:t xml:space="preserve">use them as inspiration for the boundaries interview, the way the concept deserves, but the prompts themselves are her paid membership IP. Write vooee’s own question set from scratch (the charter fields above are that start), credit the inspiration privately, never redistribute her text. If Jeanna’s membership includes commercial licensing, check the terms before leaning closer.</w:t>
       </w:r>
     </w:p>
-    <w:bookmarkEnd w:id="24"/>
     <w:bookmarkEnd w:id="25"/>
-    <w:bookmarkStart w:id="26" w:name="build-path-all-existing-vooee-patterns"/>
+    <w:bookmarkEnd w:id="26"/>
+    <w:bookmarkStart w:id="27" w:name="build-path-all-existing-vooee-patterns"/>
     <w:p>
       <w:pPr>
         <w:pStyle w:val="Heading2"/>
@@ -571,7 +551,7 @@
         <w:t xml:space="preserve"> </w:t>
       </w:r>
       <w:r>
-        <w:t xml:space="preserve">no app at all. A structured intake (Airtable form or Tally, one per leader) plus a Claude Project that ingests the responses and produces the tension report and the live drafting. Proves the session mechanics with a real client before any build.</w:t>
+        <w:t xml:space="preserve">no app at all. A structured intake (Airtable form or Tally, opened from a QR code in the room) plus a Claude Project that ingests the responses and produces the tension report and the live drafting. The live flow sets one hard requirement even at MVP: the report must be a one-click generate that lands inside the coffee break, rehearsed end to end before a real client. Two boring risks to plan for because everything now happens in the room: venue wifi (phone hotspot as backup) and a leader without a device (two spare iPads or, worst case, paper cards Jeanna types in during the break).</w:t>
       </w:r>
     </w:p>
     <w:p>
@@ -628,8 +608,8 @@
         <w:t xml:space="preserve">leaders’ answers are sensitive personnel-adjacent data. Named data location, onshore processing posture, explicit consent line on the intake, deletion on request, and the engagement’s own adopted AI policy governs the tool that helped write it. Eating our own cooking here is a selling point, say it out loud in the room.</w:t>
       </w:r>
     </w:p>
-    <w:bookmarkEnd w:id="26"/>
-    <w:bookmarkStart w:id="27" w:name="where-it-sits-commercially"/>
+    <w:bookmarkEnd w:id="27"/>
+    <w:bookmarkStart w:id="28" w:name="where-it-sits-commercially"/>
     <w:p>
       <w:pPr>
         <w:pStyle w:val="Heading2"/>
@@ -696,8 +676,8 @@
         <w:t xml:space="preserve">Demo cost is near zero once v1 exists: a two-minute screen recording of the tension report appearing is a proof-of-practice social post (pillar 1) that no competitor in the AU SMB space is showing.</w:t>
       </w:r>
     </w:p>
-    <w:bookmarkEnd w:id="27"/>
-    <w:bookmarkStart w:id="28" w:name="decisions-for-jeanna"/>
+    <w:bookmarkEnd w:id="28"/>
+    <w:bookmarkStart w:id="29" w:name="decisions-for-jeanna"/>
     <w:p>
       <w:pPr>
         <w:pStyle w:val="Heading2"/>
@@ -772,8 +752,8 @@
         <w:t xml:space="preserve">Allie Miller licensing check before the boundaries interview borrows more than inspiration.</w:t>
       </w:r>
     </w:p>
-    <w:bookmarkEnd w:id="28"/>
     <w:bookmarkEnd w:id="29"/>
+    <w:bookmarkEnd w:id="30"/>
     <w:sectPr/>
   </w:body>
 </w:document>

</xml_diff>

<commit_message>
Add two-act word cloud to Alignment Room flow: live warm-up, full clouds at the reveal
Co-Authored-By: Claude Fable 5 <noreply@anthropic.com>
Claude-Session: https://claude.ai/code/session_01PPCVtAbEtcwFeYVLmMaxYT
</commit_message>
<xml_diff>
--- a/section-ai-alignment/word/08 Alignment Room concept.docx
+++ b/section-ai-alignment/word/08 Alignment Room concept.docx
@@ -218,6 +218,98 @@
         <w:t xml:space="preserve">). Answers go to Jeanna, not to the group.</w:t>
       </w:r>
     </w:p>
+    <w:p>
+      <w:pPr>
+        <w:pStyle w:val="BodyText"/>
+      </w:pPr>
+      <w:r>
+        <w:rPr>
+          <w:bCs/>
+          <w:b/>
+        </w:rPr>
+        <w:t xml:space="preserve">The word cloud, played carefully.</w:t>
+      </w:r>
+      <w:r>
+        <w:t xml:space="preserve"> </w:t>
+      </w:r>
+      <w:r>
+        <w:t xml:space="preserve">A live word cloud building on the projector is the right theatre, in two acts:</w:t>
+      </w:r>
+      <w:r>
+        <w:t xml:space="preserve"> </w:t>
+      </w:r>
+      <w:r>
+        <w:t xml:space="preserve">-</w:t>
+      </w:r>
+      <w:r>
+        <w:t xml:space="preserve"> </w:t>
+      </w:r>
+      <w:r>
+        <w:rPr>
+          <w:bCs/>
+          <w:b/>
+        </w:rPr>
+        <w:t xml:space="preserve">Act one, during capture, warm-up only.</w:t>
+      </w:r>
+      <w:r>
+        <w:t xml:space="preserve"> </w:t>
+      </w:r>
+      <w:r>
+        <w:t xml:space="preserve">The capture opens with one designed one-word question (</w:t>
+      </w:r>
+      <w:r>
+        <w:t xml:space="preserve">“</w:t>
+      </w:r>
+      <w:r>
+        <w:t xml:space="preserve">one word for how AI makes you feel right now</w:t>
+      </w:r>
+      <w:r>
+        <w:t xml:space="preserve">”</w:t>
+      </w:r>
+      <w:r>
+        <w:t xml:space="preserve">) and the cloud grows live on screen as answers land. Anonymous, energising, and it proves to the room that the link works. Then the screen goes dark for the real questions; a live cloud during those would put words in people’s mouths, which is exactly what silent capture exists to prevent.</w:t>
+      </w:r>
+      <w:r>
+        <w:t xml:space="preserve"> </w:t>
+      </w:r>
+      <w:r>
+        <w:t xml:space="preserve">-</w:t>
+      </w:r>
+      <w:r>
+        <w:t xml:space="preserve"> </w:t>
+      </w:r>
+      <w:r>
+        <w:rPr>
+          <w:bCs/>
+          <w:b/>
+        </w:rPr>
+        <w:t xml:space="preserve">Act two, the reveal.</w:t>
+      </w:r>
+      <w:r>
+        <w:t xml:space="preserve"> </w:t>
+      </w:r>
+      <w:r>
+        <w:t xml:space="preserve">When the break ends, the full clouds animate in as the opening of the tension report: the worries cloud, the excites cloud, the</w:t>
+      </w:r>
+      <w:r>
+        <w:t xml:space="preserve"> </w:t>
+      </w:r>
+      <w:r>
+        <w:t xml:space="preserve">“</w:t>
+      </w:r>
+      <w:r>
+        <w:t xml:space="preserve">stays human</w:t>
+      </w:r>
+      <w:r>
+        <w:t xml:space="preserve">”</w:t>
+      </w:r>
+      <w:r>
+        <w:t xml:space="preserve"> </w:t>
+      </w:r>
+      <w:r>
+        <w:t xml:space="preserve">cloud. Same theatre, zero anchoring, and the contrast lands harder because the room hasn’t seen the words accumulating.</w:t>
+      </w:r>
+    </w:p>
     <w:bookmarkEnd w:id="22"/>
     <w:bookmarkStart w:id="23" w:name="the-break-that-does-the-work-10-minutes"/>
     <w:p>
@@ -551,7 +643,7 @@
         <w:t xml:space="preserve"> </w:t>
       </w:r>
       <w:r>
-        <w:t xml:space="preserve">no app at all. A structured intake (Airtable form or Tally, opened from a QR code in the room) plus a Claude Project that ingests the responses and produces the tension report and the live drafting. The live flow sets one hard requirement even at MVP: the report must be a one-click generate that lands inside the coffee break, rehearsed end to end before a real client. Two boring risks to plan for because everything now happens in the room: venue wifi (phone hotspot as backup) and a leader without a device (two spare iPads or, worst case, paper cards Jeanna types in during the break).</w:t>
+        <w:t xml:space="preserve">no app at all. A structured intake (Airtable form or Tally, opened from a QR code in the room) plus a Claude Project that ingests the responses and produces the tension report and the live drafting. The warm-up word cloud can be Mentimeter off the shelf at MVP; the built version is a small self-contained display page polling the responses (the Ikigai/Netlify stack again) so it carries vooee branding and feeds the same dataset as everything else. The live flow sets one hard requirement even at MVP: the report must be a one-click generate that lands inside the coffee break, rehearsed end to end before a real client. Two boring risks to plan for because everything now happens in the room: venue wifi (phone hotspot as backup) and a leader without a device (two spare iPads or, worst case, paper cards Jeanna types in during the break).</w:t>
       </w:r>
     </w:p>
     <w:p>

</xml_diff>

<commit_message>
Add Sprint reskin section to Alignment Room concept: one engine, two products
Co-Authored-By: Claude Fable 5 <noreply@anthropic.com>
Claude-Session: https://claude.ai/code/session_01PPCVtAbEtcwFeYVLmMaxYT
</commit_message>
<xml_diff>
--- a/section-ai-alignment/word/08 Alignment Room concept.docx
+++ b/section-ai-alignment/word/08 Alignment Room concept.docx
@@ -2,7 +2,7 @@
 <file path=word/document.xml><?xml version="1.0" encoding="utf-8"?>
 <w:document xmlns:w="http://schemas.openxmlformats.org/wordprocessingml/2006/main" xmlns:m="http://schemas.openxmlformats.org/officeDocument/2006/math" xmlns:r="http://schemas.openxmlformats.org/officeDocument/2006/relationships" xmlns:o="urn:schemas-microsoft-com:office:office" xmlns:v="urn:schemas-microsoft-com:vml" xmlns:w10="urn:schemas-microsoft-com:office:word" xmlns:a="http://schemas.openxmlformats.org/drawingml/2006/main" xmlns:pic="http://schemas.openxmlformats.org/drawingml/2006/picture" xmlns:wp="http://schemas.openxmlformats.org/drawingml/2006/wordprocessingDrawing">
   <w:body>
-    <w:bookmarkStart w:id="30" w:name="X8750f297e0c128c1124ec8e13465529e11f6b40"/>
+    <w:bookmarkStart w:id="31" w:name="X8750f297e0c128c1124ec8e13465529e11f6b40"/>
     <w:p>
       <w:pPr>
         <w:pStyle w:val="Heading1"/>
@@ -769,13 +769,21 @@
       </w:r>
     </w:p>
     <w:bookmarkEnd w:id="28"/>
-    <w:bookmarkStart w:id="29" w:name="decisions-for-jeanna"/>
+    <w:bookmarkStart w:id="29" w:name="Xed985c36290524376a7fe500d1628e7d02236c5"/>
     <w:p>
       <w:pPr>
         <w:pStyle w:val="Heading2"/>
       </w:pPr>
       <w:r>
-        <w:t xml:space="preserve">Decisions for Jeanna</w:t>
+        <w:t xml:space="preserve">The Sprint reskin (same engine, second product)</w:t>
+      </w:r>
+    </w:p>
+    <w:p>
+      <w:pPr>
+        <w:pStyle w:val="FirstParagraph"/>
+      </w:pPr>
+      <w:r>
+        <w:t xml:space="preserve">Jeanna’s call, 22 July: reskin this for the six-week AI Enablement Sprint. The engine (framed teaching → silent capture → automatic synthesis → live reveal → 1:1 depth → closing measurement) maps onto the Sprint’s existing structure almost without force:</w:t>
       </w:r>
     </w:p>
     <w:p>
@@ -787,7 +795,45 @@
         <w:pStyle w:val="Compact"/>
       </w:pPr>
       <w:r>
-        <w:t xml:space="preserve">Run the MVP (forms + Claude Project) with the next Working Session client, before building anything?</w:t>
+        <w:rPr>
+          <w:bCs/>
+          <w:b/>
+        </w:rPr>
+        <w:t xml:space="preserve">Week 1, AI Foundations:</w:t>
+      </w:r>
+      <w:r>
+        <w:t xml:space="preserve"> </w:t>
+      </w:r>
+      <w:r>
+        <w:t xml:space="preserve">the warm-up cloud (</w:t>
+      </w:r>
+      <w:r>
+        <w:t xml:space="preserve">“</w:t>
+      </w:r>
+      <w:r>
+        <w:t xml:space="preserve">one word for how AI feels right now</w:t>
+      </w:r>
+      <w:r>
+        <w:t xml:space="preserve">”</w:t>
+      </w:r>
+      <w:r>
+        <w:t xml:space="preserve">) opens the sprint; with a team cohort the anxiety cloud is Section’s 52% stat made local, on their own screen. Silent capture follows the foundations teaching: confidence baseline, worries, and the honest tool discovery. Anonymity matters</w:t>
+      </w:r>
+      <w:r>
+        <w:t xml:space="preserve"> </w:t>
+      </w:r>
+      <w:r>
+        <w:rPr>
+          <w:iCs/>
+          <w:i/>
+        </w:rPr>
+        <w:t xml:space="preserve">more</w:t>
+      </w:r>
+      <w:r>
+        <w:t xml:space="preserve"> </w:t>
+      </w:r>
+      <w:r>
+        <w:t xml:space="preserve">here than with a C-suite; nobody admits shadow AI use with their manager watching, and the anonymous tool list is exactly the discovery the governance work needs.</w:t>
       </w:r>
     </w:p>
     <w:p>
@@ -799,25 +845,30 @@
         <w:pStyle w:val="Compact"/>
       </w:pPr>
       <w:r>
-        <w:t xml:space="preserve">Naming:</w:t>
-      </w:r>
-      <w:r>
-        <w:t xml:space="preserve"> </w:t>
-      </w:r>
-      <w:r>
-        <w:t xml:space="preserve">“</w:t>
-      </w:r>
-      <w:r>
-        <w:t xml:space="preserve">The Alignment Room</w:t>
-      </w:r>
-      <w:r>
-        <w:t xml:space="preserve">”</w:t>
-      </w:r>
-      <w:r>
-        <w:t xml:space="preserve"> </w:t>
-      </w:r>
-      <w:r>
-        <w:t xml:space="preserve">is a working title; needs the usual collision check against existing product names.</w:t>
+        <w:rPr>
+          <w:bCs/>
+          <w:b/>
+        </w:rPr>
+        <w:t xml:space="preserve">Week 2, goal setting and project identification:</w:t>
+      </w:r>
+      <w:r>
+        <w:t xml:space="preserve"> </w:t>
+      </w:r>
+      <w:r>
+        <w:t xml:space="preserve">the tension report becomes an</w:t>
+      </w:r>
+      <w:r>
+        <w:t xml:space="preserve"> </w:t>
+      </w:r>
+      <w:r>
+        <w:rPr>
+          <w:bCs/>
+          <w:b/>
+        </w:rPr>
+        <w:t xml:space="preserve">opportunity map</w:t>
+      </w:r>
+      <w:r>
+        <w:t xml:space="preserve">: where the cohort’s time goes, where friction repeats, candidate projects surfaced live. The Eisenhower grid from the existing workshop decks becomes the live sorting screen instead of a static card.</w:t>
       </w:r>
     </w:p>
     <w:p>
@@ -829,7 +880,17 @@
         <w:pStyle w:val="Compact"/>
       </w:pPr>
       <w:r>
-        <w:t xml:space="preserve">Persona hosting: client’s own Claude workspace (they own it, cleaner) vs vooee-managed (stickier, more admin). Default suggestion: client-owned with vooee as keeper via the fractional seat.</w:t>
+        <w:rPr>
+          <w:bCs/>
+          <w:b/>
+        </w:rPr>
+        <w:t xml:space="preserve">Weeks 3 to 5, 1:1 coaching:</w:t>
+      </w:r>
+      <w:r>
+        <w:t xml:space="preserve"> </w:t>
+      </w:r>
+      <w:r>
+        <w:t xml:space="preserve">each person’s captured answers arrive as their coaching brief; personalisation without prep time.</w:t>
       </w:r>
     </w:p>
     <w:p>
@@ -841,11 +902,105 @@
         <w:pStyle w:val="Compact"/>
       </w:pPr>
       <w:r>
+        <w:rPr>
+          <w:bCs/>
+          <w:b/>
+        </w:rPr>
+        <w:t xml:space="preserve">Week 6, closing session:</w:t>
+      </w:r>
+      <w:r>
+        <w:t xml:space="preserve"> </w:t>
+      </w:r>
+      <w:r>
+        <w:t xml:space="preserve">re-capture, and the reveal is day-0 next to day-42: the clouds side by side, the confidence scores moved. That before/after IS the proficiency pulse from the alignment work (docs 02 and 05), which means the app doubles as the measurement instrument, and the post-sprint leadership report largely writes itself from the same data.</w:t>
+      </w:r>
+    </w:p>
+    <w:p>
+      <w:pPr>
+        <w:pStyle w:val="FirstParagraph"/>
+      </w:pPr>
+      <w:r>
+        <w:t xml:space="preserve">One build, two products: question sets and branding are the only fork. Working Session skin captures leaders and drafts governance; Sprint skin captures a cohort and drives projects plus measurement. Same Airtable, same report engine, same room theatre. If both skins prove out, the same engine likely reskins again for webinar-scale (Claude 101 live polls), but that is a later thought, not a commitment.</w:t>
+      </w:r>
+    </w:p>
+    <w:bookmarkEnd w:id="29"/>
+    <w:bookmarkStart w:id="30" w:name="decisions-for-jeanna"/>
+    <w:p>
+      <w:pPr>
+        <w:pStyle w:val="Heading2"/>
+      </w:pPr>
+      <w:r>
+        <w:t xml:space="preserve">Decisions for Jeanna</w:t>
+      </w:r>
+    </w:p>
+    <w:p>
+      <w:pPr>
+        <w:numPr>
+          <w:ilvl w:val="0"/>
+          <w:numId w:val="1003"/>
+        </w:numPr>
+        <w:pStyle w:val="Compact"/>
+      </w:pPr>
+      <w:r>
+        <w:t xml:space="preserve">Run the MVP (forms + Claude Project) with the next Working Session client, before building anything?</w:t>
+      </w:r>
+    </w:p>
+    <w:p>
+      <w:pPr>
+        <w:numPr>
+          <w:ilvl w:val="0"/>
+          <w:numId w:val="1003"/>
+        </w:numPr>
+        <w:pStyle w:val="Compact"/>
+      </w:pPr>
+      <w:r>
+        <w:t xml:space="preserve">Naming:</w:t>
+      </w:r>
+      <w:r>
+        <w:t xml:space="preserve"> </w:t>
+      </w:r>
+      <w:r>
+        <w:t xml:space="preserve">“</w:t>
+      </w:r>
+      <w:r>
+        <w:t xml:space="preserve">The Alignment Room</w:t>
+      </w:r>
+      <w:r>
+        <w:t xml:space="preserve">”</w:t>
+      </w:r>
+      <w:r>
+        <w:t xml:space="preserve"> </w:t>
+      </w:r>
+      <w:r>
+        <w:t xml:space="preserve">is a working title; needs the usual collision check against existing product names.</w:t>
+      </w:r>
+    </w:p>
+    <w:p>
+      <w:pPr>
+        <w:numPr>
+          <w:ilvl w:val="0"/>
+          <w:numId w:val="1003"/>
+        </w:numPr>
+        <w:pStyle w:val="Compact"/>
+      </w:pPr>
+      <w:r>
+        <w:t xml:space="preserve">Persona hosting: client’s own Claude workspace (they own it, cleaner) vs vooee-managed (stickier, more admin). Default suggestion: client-owned with vooee as keeper via the fractional seat.</w:t>
+      </w:r>
+    </w:p>
+    <w:p>
+      <w:pPr>
+        <w:numPr>
+          <w:ilvl w:val="0"/>
+          <w:numId w:val="1003"/>
+        </w:numPr>
+        <w:pStyle w:val="Compact"/>
+      </w:pPr>
+      <w:r>
         <w:t xml:space="preserve">Allie Miller licensing check before the boundaries interview borrows more than inspiration.</w:t>
       </w:r>
     </w:p>
-    <w:bookmarkEnd w:id="29"/>
     <w:bookmarkEnd w:id="30"/>
+    <w:bookmarkEnd w:id="31"/>
     <w:sectPr/>
   </w:body>
 </w:document>
@@ -1120,6 +1275,9 @@
     <w:abstractNumId w:val="991"/>
   </w:num>
   <w:num w:numId="1002">
+    <w:abstractNumId w:val="991"/>
+  </w:num>
+  <w:num w:numId="1003">
     <w:abstractNumId w:val="99411"/>
     <w:lvlOverride w:ilvl="0">
       <w:startOverride w:val="1"/>

</xml_diff>